<commit_message>
Implement EID submission readiness package
</commit_message>
<xml_diff>
--- a/docs/submission_eid/cover_letter_eid.docx
+++ b/docs/submission_eid/cover_letter_eid.docx
@@ -74,7 +74,22 @@
           <w:i w:val="0"/>
           <w:sz w:val="24"/>
         </w:rPr>
-        <w:t>We plan to submit "Sparse Public Surveillance Limits Forecasting of Reported</w:t>
+        <w:t>Dear Editors:</w:t>
+      </w:r>
+    </w:p>
+    <w:p>
+      <w:pPr>
+        <w:spacing w:before="0" w:after="0" w:line="480" w:lineRule="auto"/>
+        <w:jc w:val="left"/>
+      </w:pPr>
+      <w:r>
+        <w:rPr>
+          <w:rFonts w:ascii="Times New Roman" w:hAnsi="Times New Roman"/>
+          <w:b w:val="0"/>
+          <w:i w:val="0"/>
+          <w:sz w:val="24"/>
+        </w:rPr>
+        <w:t>We submit "Sparse Public Surveillance Limits Forecasting of Reported</w:t>
       </w:r>
     </w:p>
     <w:p>
@@ -122,22 +137,7 @@
           <w:i w:val="0"/>
           <w:sz w:val="24"/>
         </w:rPr>
-        <w:t xml:space="preserve"> after the</w:t>
-      </w:r>
-    </w:p>
-    <w:p>
-      <w:pPr>
-        <w:spacing w:before="0" w:after="0" w:line="480" w:lineRule="auto"/>
-        <w:jc w:val="left"/>
-      </w:pPr>
-      <w:r>
-        <w:rPr>
-          <w:rFonts w:ascii="Times New Roman" w:hAnsi="Times New Roman"/>
-          <w:b w:val="0"/>
-          <w:i w:val="0"/>
-          <w:sz w:val="24"/>
-        </w:rPr>
-        <w:t>remaining EID modeling-compliance analyses are complete.</w:t>
+        <w:t>.</w:t>
       </w:r>
     </w:p>
     <w:p>
@@ -167,7 +167,7 @@
           <w:i w:val="0"/>
           <w:sz w:val="24"/>
         </w:rPr>
-        <w:t>reported hantavirus incidence in EU/EEA countries, 2019-2023. Its public-health</w:t>
+        <w:t>reported hantavirus incidence in EU/EEA countries during 2019-2023. The</w:t>
       </w:r>
     </w:p>
     <w:p>
@@ -182,7 +182,7 @@
           <w:i w:val="0"/>
           <w:sz w:val="24"/>
         </w:rPr>
-        <w:t>contribution is not a deployable prediction system. The contribution is a</w:t>
+        <w:t>public-health contribution is not a deployable prediction system. The</w:t>
       </w:r>
     </w:p>
     <w:p>
@@ -197,7 +197,7 @@
           <w:i w:val="0"/>
           <w:sz w:val="24"/>
         </w:rPr>
-        <w:t>calibration-aware evaluation showing that sparse annual public data do not</w:t>
+        <w:t>contribution is a calibration-aware evaluation showing that sparse annual</w:t>
       </w:r>
     </w:p>
     <w:p>
@@ -212,7 +212,7 @@
           <w:i w:val="0"/>
           <w:sz w:val="24"/>
         </w:rPr>
-        <w:t>support strong covariate-driven forecasting claims and that simple</w:t>
+        <w:t>public data do not support strong covariate-driven forecasting claims and that</w:t>
       </w:r>
     </w:p>
     <w:p>
@@ -227,7 +227,7 @@
           <w:i w:val="0"/>
           <w:sz w:val="24"/>
         </w:rPr>
-        <w:t>surveillance-history baselines remain difficult to beat.</w:t>
+        <w:t>simple surveillance-history baselines remain difficult to beat.</w:t>
       </w:r>
     </w:p>
     <w:p>
@@ -242,7 +242,7 @@
           <w:i w:val="0"/>
           <w:sz w:val="24"/>
         </w:rPr>
-        <w:t>The final submission should emphasize four contributions relevant to EID</w:t>
+        <w:t>The submission package includes an EID-style model-input table listing sources,</w:t>
       </w:r>
     </w:p>
     <w:p>
@@ -257,7 +257,7 @@
           <w:i w:val="0"/>
           <w:sz w:val="24"/>
         </w:rPr>
-        <w:t>readers:</w:t>
+        <w:t>ranges, missingness rules, and inclusion logic; a model schematic; sensitivity</w:t>
       </w:r>
     </w:p>
     <w:p>
@@ -272,7 +272,7 @@
           <w:i w:val="0"/>
           <w:sz w:val="24"/>
         </w:rPr>
-        <w:t>1. Exact reconciliation of 2019-2023 ECDC annual hantavirus totals across 142</w:t>
+        <w:t>analyses for surveillance-quality caveats and COVID-era training years;</w:t>
       </w:r>
     </w:p>
     <w:p>
@@ -287,7 +287,7 @@
           <w:i w:val="0"/>
           <w:sz w:val="24"/>
         </w:rPr>
-        <w:t xml:space="preserve">   EU/EEA country-years.</w:t>
+        <w:t>leave-one-country-out influence analyses; calibration-localization tables; and</w:t>
       </w:r>
     </w:p>
     <w:p>
@@ -302,7 +302,7 @@
           <w:i w:val="0"/>
           <w:sz w:val="24"/>
         </w:rPr>
-        <w:t>2. Probabilistic evaluation using weighted interval score, 90% empirical</w:t>
+        <w:t>a simulation-based detectability screen. Together, these analyses support the</w:t>
       </w:r>
     </w:p>
     <w:p>
@@ -317,7 +317,7 @@
           <w:i w:val="0"/>
           <w:sz w:val="24"/>
         </w:rPr>
-        <w:t xml:space="preserve">   coverage, interval width, mean absolute error, and Brier score.</w:t>
+        <w:t>central conclusion that standardized surveillance metadata and calibrated</w:t>
       </w:r>
     </w:p>
     <w:p>
@@ -332,7 +332,7 @@
           <w:i w:val="0"/>
           <w:sz w:val="24"/>
         </w:rPr>
-        <w:t>3. Transparent negative or mixed results showing that public demographic,</w:t>
+        <w:t>uncertainty reporting are prerequisites for credible pan-European annual</w:t>
       </w:r>
     </w:p>
     <w:p>
@@ -347,67 +347,7 @@
           <w:i w:val="0"/>
           <w:sz w:val="24"/>
         </w:rPr>
-        <w:t xml:space="preserve">   land-use, climate, and source-quality covariates did not produce stable,</w:t>
-      </w:r>
-    </w:p>
-    <w:p>
-      <w:pPr>
-        <w:spacing w:before="0" w:after="0" w:line="480" w:lineRule="auto"/>
-        <w:jc w:val="left"/>
-      </w:pPr>
-      <w:r>
-        <w:rPr>
-          <w:rFonts w:ascii="Times New Roman" w:hAnsi="Times New Roman"/>
-          <w:b w:val="0"/>
-          <w:i w:val="0"/>
-          <w:sz w:val="24"/>
-        </w:rPr>
-        <w:t xml:space="preserve">   calibrated improvement over surveillance-history baselines.</w:t>
-      </w:r>
-    </w:p>
-    <w:p>
-      <w:pPr>
-        <w:spacing w:before="0" w:after="0" w:line="480" w:lineRule="auto"/>
-        <w:jc w:val="left"/>
-      </w:pPr>
-      <w:r>
-        <w:rPr>
-          <w:rFonts w:ascii="Times New Roman" w:hAnsi="Times New Roman"/>
-          <w:b w:val="0"/>
-          <w:i w:val="0"/>
-          <w:sz w:val="24"/>
-        </w:rPr>
-        <w:t>4. EID-specific sensitivity, influence, calibration-localization, and</w:t>
-      </w:r>
-    </w:p>
-    <w:p>
-      <w:pPr>
-        <w:spacing w:before="0" w:after="0" w:line="480" w:lineRule="auto"/>
-        <w:jc w:val="left"/>
-      </w:pPr>
-      <w:r>
-        <w:rPr>
-          <w:rFonts w:ascii="Times New Roman" w:hAnsi="Times New Roman"/>
-          <w:b w:val="0"/>
-          <w:i w:val="0"/>
-          <w:sz w:val="24"/>
-        </w:rPr>
-        <w:t xml:space="preserve">   detectability analyses that identify surveillance standardization and</w:t>
-      </w:r>
-    </w:p>
-    <w:p>
-      <w:pPr>
-        <w:spacing w:before="0" w:after="0" w:line="480" w:lineRule="auto"/>
-        <w:jc w:val="left"/>
-      </w:pPr>
-      <w:r>
-        <w:rPr>
-          <w:rFonts w:ascii="Times New Roman" w:hAnsi="Times New Roman"/>
-          <w:b w:val="0"/>
-          <w:i w:val="0"/>
-          <w:sz w:val="24"/>
-        </w:rPr>
-        <w:t xml:space="preserve">   uncertainty reporting as practical constraints.</w:t>
+        <w:t>hantavirus forecasting from public data.</w:t>
       </w:r>
     </w:p>
     <w:p>
@@ -527,7 +467,7 @@
           <w:i w:val="0"/>
           <w:sz w:val="24"/>
         </w:rPr>
-        <w:t>the DOI will be verified against the final clean archive version. Source data</w:t>
+        <w:t>the DOI should be verified against the final clean archive version. Source data</w:t>
       </w:r>
     </w:p>
     <w:p>
@@ -557,6 +497,66 @@
           <w:i w:val="0"/>
           <w:sz w:val="24"/>
         </w:rPr>
+        <w:t>Artificial intelligence tools were used to assist with manuscript planning,</w:t>
+      </w:r>
+    </w:p>
+    <w:p>
+      <w:pPr>
+        <w:spacing w:before="0" w:after="0" w:line="480" w:lineRule="auto"/>
+        <w:jc w:val="left"/>
+      </w:pPr>
+      <w:r>
+        <w:rPr>
+          <w:rFonts w:ascii="Times New Roman" w:hAnsi="Times New Roman"/>
+          <w:b w:val="0"/>
+          <w:i w:val="0"/>
+          <w:sz w:val="24"/>
+        </w:rPr>
+        <w:t>language editing, and pre-submission quality checks. The author verified all</w:t>
+      </w:r>
+    </w:p>
+    <w:p>
+      <w:pPr>
+        <w:spacing w:before="0" w:after="0" w:line="480" w:lineRule="auto"/>
+        <w:jc w:val="left"/>
+      </w:pPr>
+      <w:r>
+        <w:rPr>
+          <w:rFonts w:ascii="Times New Roman" w:hAnsi="Times New Roman"/>
+          <w:b w:val="0"/>
+          <w:i w:val="0"/>
+          <w:sz w:val="24"/>
+        </w:rPr>
+        <w:t>analyses, references, and claims and accepts responsibility for the final</w:t>
+      </w:r>
+    </w:p>
+    <w:p>
+      <w:pPr>
+        <w:spacing w:before="0" w:after="0" w:line="480" w:lineRule="auto"/>
+        <w:jc w:val="left"/>
+      </w:pPr>
+      <w:r>
+        <w:rPr>
+          <w:rFonts w:ascii="Times New Roman" w:hAnsi="Times New Roman"/>
+          <w:b w:val="0"/>
+          <w:i w:val="0"/>
+          <w:sz w:val="24"/>
+        </w:rPr>
+        <w:t>manuscript. No AI-generated figures were used.</w:t>
+      </w:r>
+    </w:p>
+    <w:p>
+      <w:pPr>
+        <w:spacing w:before="0" w:after="0" w:line="480" w:lineRule="auto"/>
+        <w:jc w:val="left"/>
+      </w:pPr>
+      <w:r>
+        <w:rPr>
+          <w:rFonts w:ascii="Times New Roman" w:hAnsi="Times New Roman"/>
+          <w:b w:val="0"/>
+          <w:i w:val="0"/>
+          <w:sz w:val="24"/>
+        </w:rPr>
         <w:t>The manuscript has not been submitted elsewhere. The author has no competing</w:t>
       </w:r>
     </w:p>
@@ -572,7 +572,7 @@
           <w:i w:val="0"/>
           <w:sz w:val="24"/>
         </w:rPr>
-        <w:t>interests and received no external funding for this work. The author will</w:t>
+        <w:t>interests and received no external funding for this work. The author confirms</w:t>
       </w:r>
     </w:p>
     <w:p>
@@ -587,7 +587,7 @@
           <w:i w:val="0"/>
           <w:sz w:val="24"/>
         </w:rPr>
-        <w:t>confirm final approval at submission.</w:t>
+        <w:t>approval of the final manuscript.</w:t>
       </w:r>
     </w:p>
     <w:p>

</xml_diff>